<commit_message>
upload lab5 and update all readmes
</commit_message>
<xml_diff>
--- a/Lab-01-SSH-Bruteforce-Detection/Lab1-Investigation-Writeup-Template.docx
+++ b/Lab-01-SSH-Bruteforce-Detection/Lab1-Investigation-Writeup-Template.docx
@@ -33,21 +33,6 @@
           <w:szCs w:val="24"/>
         </w:rPr>
         <w:t xml:space="preserve">SSH Brute-Force Detection in ELK</w:t>
-      </w:r>
-    </w:p>
-    <w:p>
-      <w:pPr>
-        <w:spacing w:after="240" w:before="160"/>
-      </w:pPr>
-      <w:r>
-        <w:rPr>
-          <w:i/>
-          <w:iCs/>
-          <w:color w:val="888888"/>
-          <w:sz w:val="20"/>
-          <w:szCs w:val="20"/>
-        </w:rPr>
-        <w:t xml:space="preserve">Instructions: fill in every highlighted placeholder below with your own data, screenshots, and observations from working through Lab 1. Delete this instruction paragraph before submitting or publishing your finished write-up.</w:t>
       </w:r>
     </w:p>
     <w:p>

</xml_diff>